<commit_message>
Add branded seal watermark and interactive UI
</commit_message>
<xml_diff>
--- a/Final_Project Report.docx
+++ b/Final_Project Report.docx
@@ -4,116 +4,7 @@
   <w:body>
     <w:p>
       <w:pPr>
-        <w:widowControl w:val="0"/>
-        <w:tabs>
-          <w:tab w:val="left" w:pos="990"/>
-        </w:tabs>
-        <w:overflowPunct w:val="0"/>
-        <w:autoSpaceDE w:val="0"/>
-        <w:autoSpaceDN w:val="0"/>
-        <w:adjustRightInd w:val="0"/>
-        <w:spacing w:after="0" w:line="240" w:lineRule="auto"/>
-        <w:ind w:left="540"/>
-        <w:contextualSpacing/>
-        <w:jc w:val="both"/>
-        <w:rPr>
-          <w:rFonts w:ascii="Verdana" w:eastAsia="Calibri" w:hAnsi="Verdana" w:cs="Times New Roman"/>
-          <w:b/>
-          <w:bCs/>
-          <w:color w:val="000000" w:themeColor="text1"/>
-          <w:sz w:val="24"/>
-          <w:szCs w:val="24"/>
-        </w:rPr>
-      </w:pPr>
-    </w:p>
-    <w:p>
-      <w:pPr>
         <w:spacing w:line="240" w:lineRule="auto"/>
-        <w:jc w:val="center"/>
-        <w:rPr>
-          <w:rFonts w:ascii="Verdana" w:hAnsi="Verdana"/>
-          <w:b/>
-          <w:color w:val="000000" w:themeColor="text1"/>
-          <w:sz w:val="28"/>
-        </w:rPr>
-      </w:pPr>
-      <w:r>
-        <w:rPr>
-          <w:rFonts w:ascii="Verdana" w:hAnsi="Verdana"/>
-          <w:b/>
-          <w:color w:val="000000" w:themeColor="text1"/>
-          <w:sz w:val="28"/>
-        </w:rPr>
-        <w:t>Major Project</w:t>
-      </w:r>
-      <w:r>
-        <w:rPr>
-          <w:rFonts w:ascii="Verdana" w:hAnsi="Verdana"/>
-          <w:b/>
-          <w:color w:val="000000" w:themeColor="text1"/>
-          <w:sz w:val="28"/>
-        </w:rPr>
-        <w:t xml:space="preserve"> Report</w:t>
-      </w:r>
-    </w:p>
-    <w:p>
-      <w:pPr>
-        <w:autoSpaceDE w:val="0"/>
-        <w:autoSpaceDN w:val="0"/>
-        <w:adjustRightInd w:val="0"/>
-        <w:spacing w:line="240" w:lineRule="auto"/>
-        <w:jc w:val="center"/>
-        <w:rPr>
-          <w:rFonts w:ascii="Verdana" w:hAnsi="Verdana" w:cs="Times-Roman"/>
-          <w:b/>
-          <w:color w:val="000000"/>
-          <w:sz w:val="36"/>
-          <w:szCs w:val="42"/>
-        </w:rPr>
-      </w:pPr>
-      <w:bookmarkStart w:id="0" w:name="_Hlk494467754"/>
-      <w:r>
-        <w:rPr>
-          <w:rFonts w:ascii="Verdana" w:hAnsi="Verdana" w:cs="Times-Roman"/>
-          <w:b/>
-          <w:color w:val="000000"/>
-          <w:sz w:val="36"/>
-          <w:szCs w:val="42"/>
-        </w:rPr>
-        <w:t>STUDENT PERFORMANCE PREDICTION &amp; EARLY WARNING SYSTEM</w:t>
-      </w:r>
-    </w:p>
-    <w:p>
-      <w:pPr>
-        <w:autoSpaceDE w:val="0"/>
-        <w:autoSpaceDN w:val="0"/>
-        <w:adjustRightInd w:val="0"/>
-        <w:spacing w:line="240" w:lineRule="auto"/>
-        <w:jc w:val="center"/>
-        <w:rPr>
-          <w:rFonts w:ascii="Verdana" w:hAnsi="Verdana" w:cs="Times-Roman"/>
-          <w:b/>
-          <w:color w:val="000000"/>
-          <w:sz w:val="24"/>
-          <w:szCs w:val="24"/>
-        </w:rPr>
-      </w:pPr>
-      <w:r>
-        <w:rPr>
-          <w:rFonts w:ascii="Verdana" w:hAnsi="Verdana" w:cs="Times-Roman"/>
-          <w:b/>
-          <w:color w:val="000000"/>
-          <w:sz w:val="24"/>
-          <w:szCs w:val="24"/>
-        </w:rPr>
-        <w:t>Project Category: University Based Project</w:t>
-      </w:r>
-    </w:p>
-    <w:bookmarkEnd w:id="0"/>
-    <w:p>
-      <w:pPr>
-        <w:spacing w:line="240" w:lineRule="auto"/>
-        <w:jc w:val="center"/>
         <w:rPr>
           <w:rFonts w:ascii="Verdana" w:hAnsi="Verdana"/>
           <w:i/>
@@ -122,483 +13,20 @@
           <w:szCs w:val="24"/>
         </w:rPr>
       </w:pPr>
-      <w:proofErr w:type="spellStart"/>
       <w:r>
         <w:rPr>
           <w:rFonts w:ascii="Verdana" w:hAnsi="Verdana"/>
           <w:i/>
+          <w:noProof/>
           <w:color w:val="000000" w:themeColor="text1"/>
           <w:sz w:val="24"/>
           <w:szCs w:val="24"/>
         </w:rPr>
-        <w:t>Projexa</w:t>
-      </w:r>
-      <w:proofErr w:type="spellEnd"/>
-      <w:r>
-        <w:rPr>
-          <w:rFonts w:ascii="Verdana" w:hAnsi="Verdana"/>
-          <w:i/>
-          <w:color w:val="000000" w:themeColor="text1"/>
-          <w:sz w:val="24"/>
-          <w:szCs w:val="24"/>
-        </w:rPr>
-        <w:t xml:space="preserve"> Team Id-</w:t>
-      </w:r>
-      <w:r>
-        <w:rPr>
-          <w:rFonts w:ascii="Verdana" w:hAnsi="Verdana"/>
-          <w:i/>
-          <w:color w:val="000000" w:themeColor="text1"/>
-          <w:sz w:val="24"/>
-          <w:szCs w:val="24"/>
-        </w:rPr>
-        <w:t>26E3083</w:t>
-      </w:r>
-    </w:p>
-    <w:p>
-      <w:pPr>
-        <w:spacing w:line="240" w:lineRule="auto"/>
-        <w:jc w:val="center"/>
-        <w:rPr>
-          <w:rFonts w:ascii="Verdana" w:hAnsi="Verdana"/>
-          <w:i/>
-          <w:color w:val="000000" w:themeColor="text1"/>
-          <w:sz w:val="28"/>
-        </w:rPr>
-      </w:pPr>
-      <w:r>
-        <w:rPr>
-          <w:rFonts w:ascii="Verdana" w:hAnsi="Verdana"/>
-          <w:i/>
-          <w:color w:val="000000" w:themeColor="text1"/>
-          <w:sz w:val="28"/>
-        </w:rPr>
-        <w:t xml:space="preserve">Submitted in partial </w:t>
-      </w:r>
-      <w:r>
-        <w:rPr>
-          <w:rFonts w:ascii="Verdana" w:hAnsi="Verdana"/>
-          <w:i/>
-          <w:color w:val="000000" w:themeColor="text1"/>
-          <w:sz w:val="28"/>
-        </w:rPr>
-        <w:t>fulfil</w:t>
-      </w:r>
-      <w:r>
-        <w:rPr>
-          <w:rFonts w:ascii="Verdana" w:hAnsi="Verdana"/>
-          <w:i/>
-          <w:color w:val="000000" w:themeColor="text1"/>
-          <w:sz w:val="28"/>
-        </w:rPr>
-        <w:t>ment of the requirement of the degree of</w:t>
-      </w:r>
-    </w:p>
-    <w:p>
-      <w:pPr>
-        <w:spacing w:line="240" w:lineRule="auto"/>
-        <w:jc w:val="center"/>
-        <w:rPr>
-          <w:rFonts w:ascii="Verdana" w:hAnsi="Verdana"/>
-          <w:b/>
-          <w:color w:val="000000" w:themeColor="text1"/>
-          <w:sz w:val="32"/>
-        </w:rPr>
-      </w:pPr>
-      <w:r>
-        <w:rPr>
-          <w:rFonts w:ascii="Verdana" w:hAnsi="Verdana"/>
-          <w:b/>
-          <w:color w:val="000000" w:themeColor="text1"/>
-          <w:sz w:val="32"/>
-        </w:rPr>
-        <w:t>BACHELOR OF TECHNOLOGY</w:t>
-      </w:r>
-      <w:r>
-        <w:rPr>
-          <w:rFonts w:ascii="Verdana" w:hAnsi="Verdana"/>
-          <w:b/>
-          <w:color w:val="000000" w:themeColor="text1"/>
-          <w:sz w:val="32"/>
-        </w:rPr>
-        <w:t xml:space="preserve"> (CSE/ AI&amp;ML)</w:t>
-      </w:r>
-    </w:p>
-    <w:p>
-      <w:pPr>
-        <w:spacing w:after="0" w:line="240" w:lineRule="auto"/>
-        <w:jc w:val="center"/>
-        <w:rPr>
-          <w:rFonts w:ascii="Verdana" w:hAnsi="Verdana"/>
-          <w:b/>
-          <w:color w:val="000000" w:themeColor="text1"/>
-          <w:sz w:val="28"/>
-          <w:szCs w:val="28"/>
-        </w:rPr>
-      </w:pPr>
-      <w:r>
-        <w:rPr>
-          <w:rFonts w:ascii="Verdana" w:hAnsi="Verdana"/>
-          <w:b/>
-          <w:color w:val="000000" w:themeColor="text1"/>
-          <w:sz w:val="28"/>
-          <w:szCs w:val="28"/>
-        </w:rPr>
-        <w:t>Semester-VI</w:t>
-      </w:r>
-    </w:p>
-    <w:p>
-      <w:pPr>
-        <w:spacing w:line="240" w:lineRule="auto"/>
-        <w:jc w:val="center"/>
-        <w:rPr>
-          <w:rFonts w:ascii="Verdana" w:hAnsi="Verdana"/>
-          <w:i/>
-          <w:color w:val="000000" w:themeColor="text1"/>
-          <w:sz w:val="28"/>
-          <w:szCs w:val="28"/>
-        </w:rPr>
-      </w:pPr>
-      <w:r>
-        <w:rPr>
-          <w:rFonts w:ascii="Verdana" w:hAnsi="Verdana"/>
-          <w:i/>
-          <w:color w:val="000000" w:themeColor="text1"/>
-          <w:sz w:val="28"/>
-          <w:szCs w:val="28"/>
-        </w:rPr>
-        <w:t>to</w:t>
-      </w:r>
-    </w:p>
-    <w:p>
-      <w:pPr>
-        <w:spacing w:line="240" w:lineRule="auto"/>
-        <w:jc w:val="center"/>
-        <w:rPr>
-          <w:rFonts w:ascii="Verdana" w:hAnsi="Verdana"/>
-          <w:b/>
-          <w:bCs/>
-          <w:iCs/>
-          <w:color w:val="000000" w:themeColor="text1"/>
-          <w:sz w:val="40"/>
-          <w:szCs w:val="40"/>
-        </w:rPr>
-      </w:pPr>
-      <w:r>
-        <w:rPr>
-          <w:rFonts w:ascii="Verdana" w:hAnsi="Verdana"/>
-          <w:b/>
-          <w:bCs/>
-          <w:iCs/>
-          <w:color w:val="000000" w:themeColor="text1"/>
-          <w:sz w:val="40"/>
-          <w:szCs w:val="40"/>
-        </w:rPr>
-        <w:t>K.R Mangalam University</w:t>
-      </w:r>
-    </w:p>
-    <w:p>
-      <w:pPr>
-        <w:spacing w:line="240" w:lineRule="auto"/>
-        <w:jc w:val="center"/>
-        <w:rPr>
-          <w:rFonts w:ascii="Verdana" w:hAnsi="Verdana"/>
-          <w:i/>
-          <w:color w:val="000000" w:themeColor="text1"/>
-          <w:sz w:val="28"/>
-          <w:szCs w:val="28"/>
-        </w:rPr>
-      </w:pPr>
-      <w:r>
-        <w:rPr>
-          <w:rFonts w:ascii="Verdana" w:hAnsi="Verdana"/>
-          <w:i/>
-          <w:color w:val="000000" w:themeColor="text1"/>
-          <w:sz w:val="28"/>
-          <w:szCs w:val="28"/>
-        </w:rPr>
-        <w:t>by</w:t>
-      </w:r>
-    </w:p>
-    <w:p>
-      <w:pPr>
-        <w:spacing w:after="0" w:line="240" w:lineRule="auto"/>
-        <w:ind w:left="1440"/>
-        <w:jc w:val="both"/>
-        <w:rPr>
-          <w:rFonts w:ascii="Verdana" w:hAnsi="Verdana"/>
-          <w:b/>
-          <w:color w:val="000000" w:themeColor="text1"/>
-          <w:sz w:val="28"/>
-          <w:szCs w:val="28"/>
-        </w:rPr>
-      </w:pPr>
-      <w:r>
-        <w:rPr>
-          <w:rFonts w:ascii="Verdana" w:hAnsi="Verdana"/>
-          <w:b/>
-          <w:bCs/>
-          <w:sz w:val="28"/>
-        </w:rPr>
-        <w:t xml:space="preserve">Dev (2301730073)         </w:t>
-      </w:r>
-      <w:r>
-        <w:rPr>
-          <w:rFonts w:ascii="Verdana" w:hAnsi="Verdana"/>
-          <w:b/>
-          <w:bCs/>
-          <w:sz w:val="28"/>
-        </w:rPr>
-        <w:t xml:space="preserve">  </w:t>
-      </w:r>
-      <w:r>
-        <w:rPr>
-          <w:rFonts w:ascii="Verdana" w:hAnsi="Verdana"/>
-          <w:b/>
-          <w:bCs/>
-          <w:sz w:val="28"/>
-        </w:rPr>
-        <w:t xml:space="preserve">            </w:t>
-      </w:r>
-      <w:r>
-        <w:rPr>
-          <w:rFonts w:ascii="Verdana" w:hAnsi="Verdana"/>
-          <w:b/>
-          <w:color w:val="000000" w:themeColor="text1"/>
-          <w:sz w:val="28"/>
-          <w:szCs w:val="28"/>
-        </w:rPr>
-        <w:t>Section-</w:t>
-      </w:r>
-      <w:r>
-        <w:rPr>
-          <w:rFonts w:ascii="Verdana" w:hAnsi="Verdana"/>
-          <w:b/>
-          <w:color w:val="000000" w:themeColor="text1"/>
-          <w:sz w:val="28"/>
-          <w:szCs w:val="28"/>
-        </w:rPr>
-        <w:t>B</w:t>
-      </w:r>
-    </w:p>
-    <w:p>
-      <w:pPr>
-        <w:spacing w:after="0" w:line="240" w:lineRule="auto"/>
-        <w:ind w:left="1440"/>
-        <w:jc w:val="both"/>
-        <w:rPr>
-          <w:rFonts w:ascii="Verdana" w:hAnsi="Verdana"/>
-          <w:b/>
-          <w:bCs/>
-          <w:sz w:val="28"/>
-        </w:rPr>
-      </w:pPr>
-      <w:r>
-        <w:rPr>
-          <w:rFonts w:ascii="Verdana" w:hAnsi="Verdana"/>
-          <w:b/>
-          <w:bCs/>
-          <w:sz w:val="28"/>
-        </w:rPr>
-        <w:t>Aryan Sharma</w:t>
-      </w:r>
-      <w:r>
-        <w:rPr>
-          <w:rFonts w:ascii="Verdana" w:hAnsi="Verdana"/>
-          <w:b/>
-          <w:bCs/>
-          <w:sz w:val="28"/>
-        </w:rPr>
-        <w:t xml:space="preserve"> (2301730119)      </w:t>
-      </w:r>
-      <w:r>
-        <w:rPr>
-          <w:rFonts w:ascii="Verdana" w:hAnsi="Verdana"/>
-          <w:b/>
-          <w:color w:val="000000" w:themeColor="text1"/>
-          <w:sz w:val="28"/>
-          <w:szCs w:val="28"/>
-        </w:rPr>
-        <w:t>Section-</w:t>
-      </w:r>
-      <w:r>
-        <w:rPr>
-          <w:rFonts w:ascii="Verdana" w:hAnsi="Verdana"/>
-          <w:b/>
-          <w:color w:val="000000" w:themeColor="text1"/>
-          <w:sz w:val="28"/>
-          <w:szCs w:val="28"/>
-        </w:rPr>
-        <w:t xml:space="preserve"> </w:t>
-      </w:r>
-      <w:r>
-        <w:rPr>
-          <w:rFonts w:ascii="Verdana" w:hAnsi="Verdana"/>
-          <w:b/>
-          <w:color w:val="000000" w:themeColor="text1"/>
-          <w:sz w:val="28"/>
-          <w:szCs w:val="28"/>
-        </w:rPr>
-        <w:t>B</w:t>
-      </w:r>
-    </w:p>
-    <w:p>
-      <w:pPr>
-        <w:spacing w:after="0" w:line="240" w:lineRule="auto"/>
-        <w:ind w:left="1440"/>
-        <w:jc w:val="both"/>
-        <w:rPr>
-          <w:rFonts w:ascii="Verdana" w:hAnsi="Verdana"/>
-          <w:b/>
-          <w:bCs/>
-          <w:sz w:val="28"/>
-        </w:rPr>
-      </w:pPr>
-      <w:r>
-        <w:rPr>
-          <w:rFonts w:ascii="Verdana" w:hAnsi="Verdana"/>
-          <w:b/>
-          <w:bCs/>
-          <w:sz w:val="28"/>
-        </w:rPr>
-        <w:t>Dev Sood (2301730121)              Section- B</w:t>
-      </w:r>
-    </w:p>
-    <w:p>
-      <w:pPr>
-        <w:spacing w:after="0" w:line="240" w:lineRule="auto"/>
-        <w:ind w:left="1440"/>
-        <w:jc w:val="both"/>
-        <w:rPr>
-          <w:rFonts w:ascii="Verdana" w:hAnsi="Verdana"/>
-          <w:b/>
-          <w:bCs/>
-          <w:sz w:val="28"/>
-        </w:rPr>
-      </w:pPr>
-      <w:r>
-        <w:rPr>
-          <w:rFonts w:ascii="Verdana" w:hAnsi="Verdana"/>
-          <w:b/>
-          <w:bCs/>
-          <w:sz w:val="28"/>
-        </w:rPr>
-        <w:t>Shubhi Tyagi (2301730132)        Section- B</w:t>
-      </w:r>
-    </w:p>
-    <w:p>
-      <w:pPr>
-        <w:spacing w:line="240" w:lineRule="auto"/>
-        <w:jc w:val="center"/>
-        <w:rPr>
-          <w:rFonts w:ascii="Verdana" w:hAnsi="Verdana"/>
-          <w:color w:val="000000" w:themeColor="text1"/>
-        </w:rPr>
-      </w:pPr>
-    </w:p>
-    <w:p>
-      <w:pPr>
-        <w:spacing w:line="240" w:lineRule="auto"/>
-        <w:jc w:val="center"/>
-        <w:rPr>
-          <w:rFonts w:ascii="Verdana" w:hAnsi="Verdana"/>
-          <w:color w:val="000000" w:themeColor="text1"/>
-          <w:sz w:val="28"/>
-        </w:rPr>
-      </w:pPr>
-      <w:r>
-        <w:rPr>
-          <w:rFonts w:ascii="Verdana" w:hAnsi="Verdana"/>
-          <w:color w:val="000000" w:themeColor="text1"/>
-          <w:sz w:val="28"/>
-        </w:rPr>
-        <w:t>Under the supervision of</w:t>
-      </w:r>
-    </w:p>
-    <w:p>
-      <w:pPr>
-        <w:spacing w:after="0" w:line="240" w:lineRule="auto"/>
-        <w:jc w:val="center"/>
-        <w:rPr>
-          <w:rFonts w:ascii="Verdana" w:hAnsi="Verdana"/>
-          <w:b/>
-          <w:color w:val="000000" w:themeColor="text1"/>
-          <w:sz w:val="28"/>
-        </w:rPr>
-      </w:pPr>
-      <w:r>
-        <w:rPr>
-          <w:rFonts w:ascii="Verdana" w:hAnsi="Verdana"/>
-          <w:b/>
-          <w:color w:val="000000" w:themeColor="text1"/>
-          <w:sz w:val="28"/>
-        </w:rPr>
-        <w:t>Ms. Lucky Verma</w:t>
-      </w:r>
-    </w:p>
-    <w:p>
-      <w:pPr>
-        <w:spacing w:after="0" w:line="240" w:lineRule="auto"/>
-        <w:jc w:val="center"/>
-        <w:rPr>
-          <w:rFonts w:ascii="Verdana" w:hAnsi="Verdana"/>
-          <w:b/>
-          <w:color w:val="000000" w:themeColor="text1"/>
-          <w:sz w:val="28"/>
-        </w:rPr>
-      </w:pPr>
-      <w:r>
-        <w:rPr>
-          <w:rFonts w:ascii="Verdana" w:hAnsi="Verdana"/>
-          <w:b/>
-          <w:color w:val="000000" w:themeColor="text1"/>
-          <w:sz w:val="28"/>
-        </w:rPr>
-        <w:t>Assistant Professo</w:t>
-      </w:r>
-      <w:r>
-        <w:rPr>
-          <w:rFonts w:ascii="Verdana" w:hAnsi="Verdana"/>
-          <w:b/>
-          <w:color w:val="000000" w:themeColor="text1"/>
-          <w:sz w:val="28"/>
-        </w:rPr>
-        <w:t>r</w:t>
-      </w:r>
-    </w:p>
-    <w:p>
-      <w:pPr>
-        <w:spacing w:after="0" w:line="240" w:lineRule="auto"/>
-        <w:jc w:val="center"/>
-        <w:rPr>
-          <w:rFonts w:ascii="Verdana" w:hAnsi="Verdana"/>
-          <w:b/>
-          <w:color w:val="000000" w:themeColor="text1"/>
-          <w:sz w:val="28"/>
-        </w:rPr>
-      </w:pPr>
-    </w:p>
-    <w:p>
-      <w:pPr>
-        <w:spacing w:line="240" w:lineRule="auto"/>
-        <w:jc w:val="center"/>
-        <w:rPr>
-          <w:rFonts w:ascii="Verdana" w:hAnsi="Verdana" w:cs="Times New Roman"/>
-          <w:color w:val="000000" w:themeColor="text1"/>
-          <w:sz w:val="24"/>
-          <w:szCs w:val="24"/>
-        </w:rPr>
-      </w:pPr>
-      <w:r>
-        <w:rPr>
-          <w:rFonts w:ascii="Verdana" w:hAnsi="Verdana"/>
-          <w:noProof/>
-        </w:rPr>
         <w:drawing>
-          <wp:inline distT="0" distB="0" distL="0" distR="0" wp14:anchorId="2C27A1C8" wp14:editId="0776459C">
-            <wp:extent cx="1143000" cy="1143000"/>
-            <wp:effectExtent l="0" t="0" r="0" b="0"/>
-            <wp:docPr id="318304094" name="Picture 1"/>
+          <wp:inline distT="0" distB="0" distL="0" distR="0" wp14:anchorId="0A259A67" wp14:editId="17115EC7">
+            <wp:extent cx="5990807" cy="8394305"/>
+            <wp:effectExtent l="0" t="0" r="0" b="6985"/>
+            <wp:docPr id="2041757193" name="Picture 1"/>
             <wp:cNvGraphicFramePr>
               <a:graphicFrameLocks xmlns:a="http://schemas.openxmlformats.org/drawingml/2006/main" noChangeAspect="1"/>
             </wp:cNvGraphicFramePr>
@@ -606,20 +34,18 @@
               <a:graphicData uri="http://schemas.openxmlformats.org/drawingml/2006/picture">
                 <pic:pic xmlns:pic="http://schemas.openxmlformats.org/drawingml/2006/picture">
                   <pic:nvPicPr>
-                    <pic:cNvPr id="0" name="Picture 1"/>
-                    <pic:cNvPicPr>
-                      <a:picLocks noChangeAspect="1" noChangeArrowheads="1"/>
-                    </pic:cNvPicPr>
+                    <pic:cNvPr id="2041757193" name="Picture 2041757193"/>
+                    <pic:cNvPicPr/>
                   </pic:nvPicPr>
-                  <pic:blipFill>
-                    <a:blip r:embed="rId8" cstate="print">
+                  <pic:blipFill rotWithShape="1">
+                    <a:blip r:embed="rId8">
                       <a:extLst>
                         <a:ext uri="{28A0092B-C50C-407E-A947-70E740481C1C}">
                           <a14:useLocalDpi xmlns:a14="http://schemas.microsoft.com/office/drawing/2010/main" val="0"/>
                         </a:ext>
                       </a:extLst>
                     </a:blip>
-                    <a:srcRect/>
+                    <a:srcRect l="2706" r="2137"/>
                     <a:stretch>
                       <a:fillRect/>
                     </a:stretch>
@@ -627,15 +53,19 @@
                   <pic:spPr bwMode="auto">
                     <a:xfrm>
                       <a:off x="0" y="0"/>
-                      <a:ext cx="1143000" cy="1143000"/>
+                      <a:ext cx="5997417" cy="8403567"/>
                     </a:xfrm>
                     <a:prstGeom prst="rect">
                       <a:avLst/>
                     </a:prstGeom>
-                    <a:noFill/>
                     <a:ln>
                       <a:noFill/>
                     </a:ln>
+                    <a:extLst>
+                      <a:ext uri="{53640926-AAD7-44D8-BBD7-CCE9431645EC}">
+                        <a14:shadowObscured xmlns:a14="http://schemas.microsoft.com/office/drawing/2010/main"/>
+                      </a:ext>
+                    </a:extLst>
                   </pic:spPr>
                 </pic:pic>
               </a:graphicData>
@@ -646,117 +76,6 @@
     </w:p>
     <w:p>
       <w:pPr>
-        <w:spacing w:after="0"/>
-        <w:jc w:val="center"/>
-        <w:rPr>
-          <w:rFonts w:ascii="Verdana" w:hAnsi="Verdana" w:cs="Times New Roman"/>
-          <w:color w:val="000000" w:themeColor="text1"/>
-          <w:sz w:val="24"/>
-          <w:szCs w:val="24"/>
-        </w:rPr>
-      </w:pPr>
-      <w:r>
-        <w:rPr>
-          <w:rFonts w:ascii="Verdana" w:hAnsi="Verdana" w:cs="Times New Roman"/>
-          <w:color w:val="000000" w:themeColor="text1"/>
-          <w:sz w:val="24"/>
-          <w:szCs w:val="24"/>
-        </w:rPr>
-        <w:t>Department of Computer Science and Engineering</w:t>
-      </w:r>
-    </w:p>
-    <w:p>
-      <w:pPr>
-        <w:spacing w:after="0"/>
-        <w:jc w:val="center"/>
-        <w:rPr>
-          <w:rFonts w:ascii="Verdana" w:hAnsi="Verdana" w:cs="Times New Roman"/>
-          <w:color w:val="000000" w:themeColor="text1"/>
-          <w:sz w:val="24"/>
-          <w:szCs w:val="24"/>
-        </w:rPr>
-      </w:pPr>
-      <w:r>
-        <w:rPr>
-          <w:rFonts w:ascii="Verdana" w:hAnsi="Verdana" w:cs="Times New Roman"/>
-          <w:color w:val="000000" w:themeColor="text1"/>
-          <w:sz w:val="24"/>
-          <w:szCs w:val="24"/>
-        </w:rPr>
-        <w:t>School of Engineering and Technology</w:t>
-      </w:r>
-    </w:p>
-    <w:p>
-      <w:pPr>
-        <w:spacing w:after="0"/>
-        <w:jc w:val="center"/>
-        <w:rPr>
-          <w:rFonts w:ascii="Verdana" w:hAnsi="Verdana" w:cs="Times New Roman"/>
-          <w:color w:val="000000" w:themeColor="text1"/>
-          <w:sz w:val="24"/>
-          <w:szCs w:val="24"/>
-        </w:rPr>
-      </w:pPr>
-      <w:r>
-        <w:rPr>
-          <w:rFonts w:ascii="Verdana" w:hAnsi="Verdana" w:cs="Times New Roman"/>
-          <w:color w:val="000000" w:themeColor="text1"/>
-          <w:sz w:val="24"/>
-          <w:szCs w:val="24"/>
-        </w:rPr>
-        <w:t>K.R Mangalam University</w:t>
-      </w:r>
-      <w:r>
-        <w:rPr>
-          <w:rFonts w:ascii="Verdana" w:hAnsi="Verdana" w:cs="Times New Roman"/>
-          <w:color w:val="000000" w:themeColor="text1"/>
-          <w:sz w:val="24"/>
-          <w:szCs w:val="24"/>
-        </w:rPr>
-        <w:t>, Gurugram- 122001, India</w:t>
-      </w:r>
-    </w:p>
-    <w:p>
-      <w:pPr>
-        <w:spacing w:after="0"/>
-        <w:jc w:val="center"/>
-        <w:rPr>
-          <w:rFonts w:ascii="Verdana" w:hAnsi="Verdana" w:cs="Times New Roman"/>
-          <w:color w:val="000000" w:themeColor="text1"/>
-          <w:sz w:val="24"/>
-          <w:szCs w:val="24"/>
-        </w:rPr>
-      </w:pPr>
-      <w:r>
-        <w:rPr>
-          <w:rFonts w:ascii="Verdana" w:hAnsi="Verdana" w:cs="Times New Roman"/>
-          <w:color w:val="000000" w:themeColor="text1"/>
-          <w:sz w:val="24"/>
-          <w:szCs w:val="24"/>
-        </w:rPr>
-        <w:t>May</w:t>
-      </w:r>
-      <w:r>
-        <w:rPr>
-          <w:rFonts w:ascii="Verdana" w:hAnsi="Verdana" w:cs="Times New Roman"/>
-          <w:color w:val="000000" w:themeColor="text1"/>
-          <w:sz w:val="24"/>
-          <w:szCs w:val="24"/>
-        </w:rPr>
-        <w:t xml:space="preserve"> 202</w:t>
-      </w:r>
-      <w:r>
-        <w:rPr>
-          <w:rFonts w:ascii="Verdana" w:hAnsi="Verdana" w:cs="Times New Roman"/>
-          <w:color w:val="000000" w:themeColor="text1"/>
-          <w:sz w:val="24"/>
-          <w:szCs w:val="24"/>
-        </w:rPr>
-        <w:t>6</w:t>
-      </w:r>
-    </w:p>
-    <w:p>
-      <w:pPr>
         <w:pStyle w:val="NormalWeb"/>
         <w:spacing w:before="0" w:beforeAutospacing="0" w:after="0" w:afterAutospacing="0" w:line="360" w:lineRule="auto"/>
         <w:jc w:val="center"/>
@@ -875,14 +194,6 @@
         </w:rPr>
         <w:t xml:space="preserve">             </w:t>
       </w:r>
-      <w:r>
-        <w:rPr>
-          <w:rFonts w:ascii="Verdana" w:hAnsi="Verdana" w:cs="Times New Roman"/>
-          <w:sz w:val="24"/>
-          <w:szCs w:val="24"/>
-        </w:rPr>
-        <w:t>____________________</w:t>
-      </w:r>
     </w:p>
     <w:p>
       <w:pPr>
@@ -918,14 +229,6 @@
         </w:rPr>
         <w:t xml:space="preserve">       </w:t>
       </w:r>
-      <w:r>
-        <w:rPr>
-          <w:rFonts w:ascii="Verdana" w:hAnsi="Verdana" w:cs="Times New Roman"/>
-          <w:sz w:val="24"/>
-          <w:szCs w:val="24"/>
-        </w:rPr>
-        <w:t>____________________</w:t>
-      </w:r>
     </w:p>
     <w:p>
       <w:pPr>
@@ -961,14 +264,6 @@
         </w:rPr>
         <w:t xml:space="preserve">               </w:t>
       </w:r>
-      <w:r>
-        <w:rPr>
-          <w:rFonts w:ascii="Verdana" w:hAnsi="Verdana" w:cs="Times New Roman"/>
-          <w:sz w:val="24"/>
-          <w:szCs w:val="24"/>
-        </w:rPr>
-        <w:t>____________________</w:t>
-      </w:r>
     </w:p>
     <w:p>
       <w:pPr>
@@ -1004,14 +299,6 @@
         </w:rPr>
         <w:t xml:space="preserve">         </w:t>
       </w:r>
-      <w:r>
-        <w:rPr>
-          <w:rFonts w:ascii="Verdana" w:hAnsi="Verdana" w:cs="Times New Roman"/>
-          <w:sz w:val="24"/>
-          <w:szCs w:val="24"/>
-        </w:rPr>
-        <w:t>____________________</w:t>
-      </w:r>
     </w:p>
     <w:p>
       <w:pPr>
@@ -1029,7 +316,7 @@
           <w:szCs w:val="24"/>
         </w:rPr>
         <w:pict w14:anchorId="4F6795FB">
-          <v:rect id="_x0000_i1025" style="width:0;height:1.5pt" o:hralign="center" o:hrstd="t" o:hr="t" fillcolor="#a0a0a0" stroked="f"/>
+          <v:rect id="_x0000_i1033" style="width:0;height:1.5pt" o:hralign="center" o:hrstd="t" o:hr="t" fillcolor="#a0a0a0" stroked="f"/>
         </w:pict>
       </w:r>
     </w:p>
@@ -1058,7 +345,33 @@
           <w:sz w:val="24"/>
           <w:szCs w:val="24"/>
         </w:rPr>
-        <w:t xml:space="preserve"> ____________ </w:t>
+        <w:t xml:space="preserve"> </w:t>
+      </w:r>
+      <w:r>
+        <w:rPr>
+          <w:rFonts w:ascii="Verdana" w:hAnsi="Verdana"/>
+          <w:sz w:val="24"/>
+          <w:szCs w:val="24"/>
+          <w:u w:val="single"/>
+        </w:rPr>
+        <w:t>_</w:t>
+      </w:r>
+      <w:r>
+        <w:rPr>
+          <w:rFonts w:ascii="Verdana" w:hAnsi="Verdana"/>
+          <w:sz w:val="24"/>
+          <w:szCs w:val="24"/>
+          <w:u w:val="single"/>
+        </w:rPr>
+        <w:t>16/04/2026</w:t>
+      </w:r>
+      <w:r>
+        <w:rPr>
+          <w:rFonts w:ascii="Verdana" w:hAnsi="Verdana"/>
+          <w:sz w:val="24"/>
+          <w:szCs w:val="24"/>
+        </w:rPr>
+        <w:t xml:space="preserve"> </w:t>
       </w:r>
     </w:p>
     <w:p>
@@ -1126,38 +439,6 @@
       <w:pPr>
         <w:pStyle w:val="NormalWeb"/>
         <w:spacing w:before="0" w:beforeAutospacing="0" w:after="0" w:afterAutospacing="0" w:line="360" w:lineRule="auto"/>
-        <w:jc w:val="center"/>
-        <w:rPr>
-          <w:rFonts w:ascii="Verdana" w:hAnsi="Verdana"/>
-          <w:sz w:val="28"/>
-          <w:szCs w:val="28"/>
-        </w:rPr>
-      </w:pPr>
-      <w:r>
-        <w:rPr>
-          <w:rFonts w:ascii="Verdana" w:hAnsi="Verdana"/>
-          <w:b/>
-          <w:bCs/>
-          <w:sz w:val="28"/>
-          <w:szCs w:val="28"/>
-        </w:rPr>
-        <w:lastRenderedPageBreak/>
-        <w:t>CERTIFICATE</w:t>
-      </w:r>
-    </w:p>
-    <w:p>
-      <w:pPr>
-        <w:spacing w:line="360" w:lineRule="auto"/>
-        <w:jc w:val="both"/>
-        <w:rPr>
-          <w:rFonts w:ascii="Verdana" w:hAnsi="Verdana"/>
-        </w:rPr>
-      </w:pPr>
-    </w:p>
-    <w:p>
-      <w:pPr>
-        <w:pStyle w:val="NormalWeb"/>
-        <w:spacing w:before="0" w:beforeAutospacing="0" w:after="0" w:afterAutospacing="0" w:line="360" w:lineRule="auto"/>
         <w:jc w:val="both"/>
         <w:rPr>
           <w:rFonts w:ascii="Verdana" w:hAnsi="Verdana"/>
@@ -1167,546 +448,61 @@
       <w:r>
         <w:rPr>
           <w:rFonts w:ascii="Verdana" w:hAnsi="Verdana"/>
+          <w:noProof/>
           <w:color w:val="000000"/>
         </w:rPr>
-        <w:t xml:space="preserve">This is to certify that the students listed below have successfully completed a project based on a </w:t>
-      </w:r>
-      <w:proofErr w:type="gramStart"/>
-      <w:r>
-        <w:rPr>
-          <w:rFonts w:ascii="Verdana" w:hAnsi="Verdana"/>
-          <w:b/>
-          <w:bCs/>
-          <w:color w:val="000000"/>
-        </w:rPr>
-        <w:t>University</w:t>
-      </w:r>
-      <w:proofErr w:type="gramEnd"/>
-      <w:r>
-        <w:rPr>
-          <w:rFonts w:ascii="Verdana" w:hAnsi="Verdana"/>
-          <w:b/>
-          <w:bCs/>
-          <w:color w:val="000000"/>
-        </w:rPr>
-        <w:t>-based problem</w:t>
-      </w:r>
-      <w:r>
-        <w:rPr>
-          <w:rFonts w:ascii="Verdana" w:hAnsi="Verdana"/>
-          <w:color w:val="000000"/>
-        </w:rPr>
-        <w:t xml:space="preserve">, undertaken as part of their academic or innovation-related engagement at </w:t>
-      </w:r>
-      <w:r>
-        <w:rPr>
-          <w:rFonts w:ascii="Verdana" w:hAnsi="Verdana"/>
-          <w:b/>
-          <w:bCs/>
-          <w:color w:val="000000"/>
-        </w:rPr>
-        <w:t>K. R. Mangalam University</w:t>
-      </w:r>
-      <w:r>
-        <w:rPr>
-          <w:rFonts w:ascii="Verdana" w:hAnsi="Verdana"/>
-          <w:color w:val="000000"/>
-        </w:rPr>
-        <w:t>.</w:t>
-      </w:r>
-    </w:p>
-    <w:p>
-      <w:pPr>
-        <w:pStyle w:val="NormalWeb"/>
-        <w:spacing w:before="0" w:beforeAutospacing="0" w:after="0" w:afterAutospacing="0" w:line="360" w:lineRule="auto"/>
-        <w:jc w:val="both"/>
-        <w:rPr>
-          <w:rFonts w:ascii="Verdana" w:hAnsi="Verdana"/>
-          <w:color w:val="000000"/>
-        </w:rPr>
-      </w:pPr>
-      <w:r>
-        <w:rPr>
-          <w:rFonts w:ascii="Verdana" w:hAnsi="Verdana"/>
-          <w:b/>
-          <w:bCs/>
-          <w:color w:val="000000"/>
-        </w:rPr>
-        <w:t>Title of the Project:</w:t>
-      </w:r>
-      <w:r>
-        <w:rPr>
-          <w:rFonts w:ascii="Verdana" w:hAnsi="Verdana"/>
-          <w:color w:val="000000"/>
-        </w:rPr>
-        <w:t xml:space="preserve"> “AI-BASED STUDENT PERFORMANCE PREDICTION &amp; EARLY WARNING SYSTEM”</w:t>
-      </w:r>
-    </w:p>
-    <w:p>
-      <w:pPr>
-        <w:pStyle w:val="NormalWeb"/>
-        <w:spacing w:before="0" w:beforeAutospacing="0" w:after="0" w:afterAutospacing="0" w:line="360" w:lineRule="auto"/>
-        <w:jc w:val="both"/>
-        <w:rPr>
-          <w:rFonts w:ascii="Verdana" w:hAnsi="Verdana"/>
-          <w:color w:val="000000"/>
-        </w:rPr>
-      </w:pPr>
-      <w:r>
-        <w:rPr>
-          <w:rFonts w:ascii="Verdana" w:hAnsi="Verdana"/>
-          <w:b/>
-          <w:bCs/>
-          <w:color w:val="000000"/>
-        </w:rPr>
-        <w:t>Name(s) of Student(s):</w:t>
-      </w:r>
-    </w:p>
-    <w:p>
-      <w:pPr>
-        <w:pStyle w:val="NormalWeb"/>
-        <w:numPr>
-          <w:ilvl w:val="0"/>
-          <w:numId w:val="51"/>
-        </w:numPr>
-        <w:spacing w:before="0" w:beforeAutospacing="0" w:after="0" w:afterAutospacing="0" w:line="360" w:lineRule="auto"/>
-        <w:jc w:val="both"/>
-        <w:rPr>
-          <w:rFonts w:ascii="Verdana" w:hAnsi="Verdana"/>
-          <w:color w:val="000000"/>
-        </w:rPr>
-      </w:pPr>
-      <w:r>
-        <w:rPr>
-          <w:rFonts w:ascii="Verdana" w:hAnsi="Verdana"/>
-          <w:b/>
-          <w:bCs/>
-          <w:color w:val="000000"/>
-        </w:rPr>
-        <w:t>DEV DAGAR</w:t>
-      </w:r>
-      <w:r>
-        <w:rPr>
-          <w:rFonts w:ascii="Verdana" w:hAnsi="Verdana"/>
-          <w:color w:val="000000"/>
-        </w:rPr>
-        <w:t xml:space="preserve"> – Roll No: </w:t>
-      </w:r>
-      <w:r>
-        <w:rPr>
-          <w:rFonts w:ascii="Verdana" w:hAnsi="Verdana"/>
-          <w:b/>
-          <w:bCs/>
-          <w:color w:val="000000"/>
-        </w:rPr>
-        <w:t>2301730073</w:t>
-      </w:r>
-    </w:p>
-    <w:p>
-      <w:pPr>
-        <w:pStyle w:val="NormalWeb"/>
-        <w:numPr>
-          <w:ilvl w:val="0"/>
-          <w:numId w:val="51"/>
-        </w:numPr>
-        <w:spacing w:before="0" w:beforeAutospacing="0" w:after="0" w:afterAutospacing="0" w:line="360" w:lineRule="auto"/>
-        <w:jc w:val="both"/>
-        <w:rPr>
-          <w:rFonts w:ascii="Verdana" w:hAnsi="Verdana"/>
-          <w:color w:val="000000"/>
-        </w:rPr>
-      </w:pPr>
-      <w:r>
-        <w:rPr>
-          <w:rFonts w:ascii="Verdana" w:hAnsi="Verdana"/>
-          <w:b/>
-          <w:bCs/>
-          <w:color w:val="000000"/>
-        </w:rPr>
-        <w:t>SHUBHI TYAGI</w:t>
-      </w:r>
-      <w:r>
-        <w:rPr>
-          <w:rFonts w:ascii="Verdana" w:hAnsi="Verdana"/>
-          <w:color w:val="000000"/>
-        </w:rPr>
-        <w:t xml:space="preserve"> – Roll No: </w:t>
-      </w:r>
-      <w:r>
-        <w:rPr>
-          <w:rFonts w:ascii="Verdana" w:hAnsi="Verdana"/>
-          <w:b/>
-          <w:bCs/>
-          <w:color w:val="000000"/>
-        </w:rPr>
-        <w:t>2301730132</w:t>
-      </w:r>
-    </w:p>
-    <w:p>
-      <w:pPr>
-        <w:pStyle w:val="NormalWeb"/>
-        <w:numPr>
-          <w:ilvl w:val="0"/>
-          <w:numId w:val="51"/>
-        </w:numPr>
-        <w:spacing w:before="0" w:beforeAutospacing="0" w:after="0" w:afterAutospacing="0" w:line="360" w:lineRule="auto"/>
-        <w:jc w:val="both"/>
-        <w:rPr>
-          <w:rFonts w:ascii="Verdana" w:hAnsi="Verdana"/>
-          <w:color w:val="000000"/>
-        </w:rPr>
-      </w:pPr>
-      <w:r>
-        <w:rPr>
-          <w:rFonts w:ascii="Verdana" w:hAnsi="Verdana"/>
-          <w:b/>
-          <w:bCs/>
-          <w:color w:val="000000"/>
-        </w:rPr>
-        <w:t>ARYAN SHARMA</w:t>
-      </w:r>
-      <w:r>
-        <w:rPr>
-          <w:rFonts w:ascii="Verdana" w:hAnsi="Verdana"/>
-          <w:color w:val="000000"/>
-        </w:rPr>
-        <w:t xml:space="preserve"> – Roll No: </w:t>
-      </w:r>
-      <w:r>
-        <w:rPr>
-          <w:rFonts w:ascii="Verdana" w:hAnsi="Verdana"/>
-          <w:b/>
-          <w:bCs/>
-          <w:color w:val="000000"/>
-        </w:rPr>
-        <w:t>2301730119</w:t>
-      </w:r>
-    </w:p>
-    <w:p>
-      <w:pPr>
-        <w:pStyle w:val="NormalWeb"/>
-        <w:numPr>
-          <w:ilvl w:val="0"/>
-          <w:numId w:val="51"/>
-        </w:numPr>
-        <w:spacing w:before="0" w:beforeAutospacing="0" w:after="0" w:afterAutospacing="0" w:line="360" w:lineRule="auto"/>
-        <w:jc w:val="both"/>
-        <w:rPr>
-          <w:rFonts w:ascii="Verdana" w:hAnsi="Verdana"/>
-          <w:color w:val="000000"/>
-        </w:rPr>
-      </w:pPr>
-      <w:r>
-        <w:rPr>
-          <w:rFonts w:ascii="Verdana" w:hAnsi="Verdana"/>
-          <w:b/>
-          <w:bCs/>
-          <w:color w:val="000000"/>
-        </w:rPr>
-        <w:t>DEV SOOD</w:t>
-      </w:r>
-      <w:r>
-        <w:rPr>
-          <w:rFonts w:ascii="Verdana" w:hAnsi="Verdana"/>
-          <w:color w:val="000000"/>
-        </w:rPr>
-        <w:t xml:space="preserve"> – Roll No: </w:t>
-      </w:r>
-      <w:r>
-        <w:rPr>
-          <w:rFonts w:ascii="Verdana" w:hAnsi="Verdana"/>
-          <w:b/>
-          <w:bCs/>
-          <w:color w:val="000000"/>
-        </w:rPr>
-        <w:t>2301730121</w:t>
-      </w:r>
-    </w:p>
-    <w:p>
-      <w:pPr>
-        <w:pStyle w:val="NormalWeb"/>
-        <w:spacing w:before="0" w:beforeAutospacing="0" w:after="0" w:afterAutospacing="0" w:line="360" w:lineRule="auto"/>
-        <w:jc w:val="both"/>
-        <w:rPr>
-          <w:rFonts w:ascii="Verdana" w:hAnsi="Verdana"/>
-          <w:color w:val="000000"/>
-        </w:rPr>
-      </w:pPr>
-      <w:r>
-        <w:rPr>
-          <w:rFonts w:ascii="Verdana" w:hAnsi="Verdana"/>
-          <w:b/>
-          <w:bCs/>
-          <w:color w:val="000000"/>
-        </w:rPr>
-        <w:t>Duration:</w:t>
-      </w:r>
-      <w:r>
-        <w:rPr>
-          <w:rFonts w:ascii="Verdana" w:hAnsi="Verdana"/>
-          <w:color w:val="000000"/>
-        </w:rPr>
-        <w:t xml:space="preserve"> From </w:t>
-      </w:r>
-      <w:r>
-        <w:rPr>
-          <w:rFonts w:ascii="Verdana" w:hAnsi="Verdana"/>
-          <w:b/>
-          <w:bCs/>
-          <w:color w:val="000000"/>
-        </w:rPr>
-        <w:t>January 2026</w:t>
-      </w:r>
-      <w:r>
-        <w:rPr>
-          <w:rFonts w:ascii="Verdana" w:hAnsi="Verdana"/>
-          <w:color w:val="000000"/>
-        </w:rPr>
-        <w:t xml:space="preserve"> to </w:t>
-      </w:r>
-      <w:r>
-        <w:rPr>
-          <w:rFonts w:ascii="Verdana" w:hAnsi="Verdana"/>
-          <w:b/>
-          <w:bCs/>
-          <w:color w:val="000000"/>
-        </w:rPr>
-        <w:t>May 2026</w:t>
-      </w:r>
-    </w:p>
-    <w:p>
-      <w:pPr>
-        <w:pStyle w:val="NormalWeb"/>
-        <w:spacing w:before="0" w:beforeAutospacing="0" w:after="0" w:afterAutospacing="0" w:line="360" w:lineRule="auto"/>
-        <w:jc w:val="both"/>
-        <w:rPr>
-          <w:rFonts w:ascii="Verdana" w:hAnsi="Verdana"/>
-          <w:color w:val="000000"/>
-        </w:rPr>
-      </w:pPr>
-      <w:r>
-        <w:rPr>
-          <w:rFonts w:ascii="Verdana" w:hAnsi="Verdana"/>
-          <w:color w:val="000000"/>
-        </w:rPr>
-        <w:t xml:space="preserve">This is to acknowledge that the above-mentioned project has been </w:t>
-      </w:r>
-      <w:r>
-        <w:rPr>
-          <w:rFonts w:ascii="Verdana" w:hAnsi="Verdana"/>
-          <w:b/>
-          <w:bCs/>
-          <w:color w:val="000000"/>
-        </w:rPr>
-        <w:t>successfully completed</w:t>
-      </w:r>
-      <w:r>
-        <w:rPr>
-          <w:rFonts w:ascii="Verdana" w:hAnsi="Verdana"/>
-          <w:color w:val="000000"/>
-        </w:rPr>
-        <w:t xml:space="preserve"> and has effectively addressed a </w:t>
-      </w:r>
-      <w:r>
-        <w:rPr>
-          <w:rFonts w:ascii="Verdana" w:hAnsi="Verdana"/>
-          <w:b/>
-          <w:bCs/>
-          <w:color w:val="000000"/>
-        </w:rPr>
-        <w:t>real-world problem within the university ecosystem</w:t>
-      </w:r>
-      <w:r>
-        <w:rPr>
-          <w:rFonts w:ascii="Verdana" w:hAnsi="Verdana"/>
-          <w:color w:val="000000"/>
-        </w:rPr>
-        <w:t xml:space="preserve">. The initiative is appreciated for its </w:t>
-      </w:r>
-      <w:r>
-        <w:rPr>
-          <w:rFonts w:ascii="Verdana" w:hAnsi="Verdana"/>
-          <w:b/>
-          <w:bCs/>
-          <w:color w:val="000000"/>
-        </w:rPr>
-        <w:t>innovation, practical relevance, and contribution</w:t>
-      </w:r>
-      <w:r>
-        <w:rPr>
-          <w:rFonts w:ascii="Verdana" w:hAnsi="Verdana"/>
-          <w:color w:val="000000"/>
-        </w:rPr>
-        <w:t xml:space="preserve"> toward institutional improvement and </w:t>
-      </w:r>
-      <w:r>
-        <w:rPr>
-          <w:rFonts w:ascii="Verdana" w:hAnsi="Verdana"/>
-          <w:b/>
-          <w:bCs/>
-          <w:color w:val="000000"/>
-        </w:rPr>
-        <w:t>student-led problem solving</w:t>
-      </w:r>
-      <w:r>
-        <w:rPr>
-          <w:rFonts w:ascii="Verdana" w:hAnsi="Verdana"/>
-          <w:color w:val="000000"/>
-        </w:rPr>
-        <w:t>.</w:t>
-      </w:r>
-    </w:p>
-    <w:p>
-      <w:pPr>
-        <w:pStyle w:val="NormalWeb"/>
-        <w:spacing w:before="0" w:beforeAutospacing="0" w:after="0" w:afterAutospacing="0" w:line="360" w:lineRule="auto"/>
-        <w:jc w:val="both"/>
-        <w:rPr>
-          <w:rFonts w:ascii="Verdana" w:hAnsi="Verdana"/>
-          <w:color w:val="000000"/>
-        </w:rPr>
-      </w:pPr>
-      <w:r>
-        <w:rPr>
-          <w:rFonts w:ascii="Verdana" w:hAnsi="Verdana"/>
-          <w:color w:val="000000"/>
-        </w:rPr>
-        <w:t>We congratulate the project team for their dedication, creativity, and successful completion of this university-based initiative.</w:t>
-      </w:r>
-    </w:p>
-    <w:p>
-      <w:pPr>
-        <w:pStyle w:val="NormalWeb"/>
-        <w:spacing w:before="0" w:beforeAutospacing="0" w:after="0" w:afterAutospacing="0" w:line="360" w:lineRule="auto"/>
-        <w:jc w:val="both"/>
-        <w:rPr>
-          <w:rFonts w:ascii="Verdana" w:hAnsi="Verdana"/>
-          <w:color w:val="000000"/>
-        </w:rPr>
-      </w:pPr>
-    </w:p>
-    <w:p>
-      <w:pPr>
-        <w:pStyle w:val="NormalWeb"/>
-        <w:spacing w:before="0" w:beforeAutospacing="0" w:after="0" w:afterAutospacing="0" w:line="360" w:lineRule="auto"/>
-        <w:rPr>
-          <w:rFonts w:ascii="Verdana" w:hAnsi="Verdana"/>
-        </w:rPr>
-      </w:pPr>
-      <w:r>
-        <w:rPr>
-          <w:rFonts w:ascii="Verdana" w:hAnsi="Verdana"/>
-          <w:b/>
-          <w:bCs/>
-        </w:rPr>
-        <w:t>Signature: _________________________</w:t>
-      </w:r>
-      <w:r>
-        <w:rPr>
-          <w:rFonts w:ascii="Verdana" w:hAnsi="Verdana"/>
-        </w:rPr>
-        <w:t xml:space="preserve"> </w:t>
-      </w:r>
-    </w:p>
-    <w:p>
-      <w:pPr>
-        <w:pStyle w:val="NormalWeb"/>
-        <w:spacing w:before="0" w:beforeAutospacing="0" w:after="0" w:afterAutospacing="0" w:line="360" w:lineRule="auto"/>
-        <w:rPr>
-          <w:rFonts w:ascii="Verdana" w:hAnsi="Verdana"/>
-        </w:rPr>
-      </w:pPr>
-      <w:r>
-        <w:rPr>
-          <w:rFonts w:ascii="Verdana" w:hAnsi="Verdana"/>
-        </w:rPr>
-        <w:t xml:space="preserve">Ms. Lucky Verma </w:t>
-      </w:r>
-    </w:p>
-    <w:p>
-      <w:pPr>
-        <w:pStyle w:val="NormalWeb"/>
-        <w:spacing w:before="0" w:beforeAutospacing="0" w:after="0" w:afterAutospacing="0" w:line="360" w:lineRule="auto"/>
-        <w:rPr>
-          <w:rFonts w:ascii="Verdana" w:hAnsi="Verdana"/>
-        </w:rPr>
-      </w:pPr>
-      <w:r>
-        <w:rPr>
-          <w:rFonts w:ascii="Verdana" w:hAnsi="Verdana"/>
-        </w:rPr>
-        <w:t>Project Mentor Name</w:t>
-      </w:r>
-    </w:p>
-    <w:p>
-      <w:pPr>
-        <w:pStyle w:val="NormalWeb"/>
-        <w:spacing w:before="0" w:beforeAutospacing="0" w:after="0" w:afterAutospacing="0" w:line="360" w:lineRule="auto"/>
-        <w:rPr>
-          <w:rFonts w:ascii="Verdana" w:hAnsi="Verdana"/>
-        </w:rPr>
-      </w:pPr>
-      <w:r>
-        <w:rPr>
-          <w:rFonts w:ascii="Verdana" w:hAnsi="Verdana"/>
-          <w:b/>
-          <w:bCs/>
-        </w:rPr>
-        <w:t>Date:</w:t>
-      </w:r>
-      <w:r>
-        <w:rPr>
-          <w:rFonts w:ascii="Verdana" w:hAnsi="Verdana"/>
-        </w:rPr>
-        <w:t xml:space="preserve"> </w:t>
-      </w:r>
-    </w:p>
-    <w:p>
-      <w:pPr>
-        <w:pStyle w:val="NormalWeb"/>
-        <w:spacing w:before="0" w:beforeAutospacing="0" w:after="0" w:afterAutospacing="0" w:line="360" w:lineRule="auto"/>
-        <w:rPr>
-          <w:rFonts w:ascii="Verdana" w:hAnsi="Verdana"/>
-        </w:rPr>
-      </w:pPr>
-      <w:r>
-        <w:rPr>
-          <w:rFonts w:ascii="Verdana" w:hAnsi="Verdana"/>
-        </w:rPr>
-        <w:t>School of Engineering &amp; Technology K. R. Mangalam University</w:t>
-      </w:r>
-    </w:p>
-    <w:p>
-      <w:pPr>
-        <w:pStyle w:val="NormalWeb"/>
-        <w:spacing w:before="0" w:beforeAutospacing="0" w:after="0" w:afterAutospacing="0" w:line="360" w:lineRule="auto"/>
-        <w:jc w:val="both"/>
-        <w:rPr>
-          <w:rFonts w:ascii="Verdana" w:hAnsi="Verdana"/>
-        </w:rPr>
-      </w:pPr>
-    </w:p>
-    <w:p>
-      <w:pPr>
-        <w:pStyle w:val="NormalWeb"/>
-        <w:spacing w:before="0" w:beforeAutospacing="0" w:after="0" w:afterAutospacing="0" w:line="360" w:lineRule="auto"/>
-        <w:jc w:val="both"/>
-        <w:rPr>
-          <w:rFonts w:ascii="Verdana" w:hAnsi="Verdana"/>
-          <w:color w:val="000000"/>
-        </w:rPr>
-      </w:pPr>
-    </w:p>
-    <w:p>
-      <w:pPr>
-        <w:pStyle w:val="NormalWeb"/>
-        <w:spacing w:before="0" w:beforeAutospacing="0" w:after="0" w:afterAutospacing="0" w:line="360" w:lineRule="auto"/>
-        <w:jc w:val="both"/>
-        <w:rPr>
-          <w:rFonts w:ascii="Verdana" w:hAnsi="Verdana"/>
-          <w:color w:val="000000"/>
-        </w:rPr>
-      </w:pPr>
+        <w:lastRenderedPageBreak/>
+        <w:drawing>
+          <wp:inline distT="0" distB="0" distL="0" distR="0" wp14:anchorId="3813A940" wp14:editId="52BEEB84">
+            <wp:extent cx="6329454" cy="8229600"/>
+            <wp:effectExtent l="0" t="0" r="0" b="0"/>
+            <wp:docPr id="1703139129" name="Picture 2"/>
+            <wp:cNvGraphicFramePr>
+              <a:graphicFrameLocks xmlns:a="http://schemas.openxmlformats.org/drawingml/2006/main" noChangeAspect="1"/>
+            </wp:cNvGraphicFramePr>
+            <a:graphic xmlns:a="http://schemas.openxmlformats.org/drawingml/2006/main">
+              <a:graphicData uri="http://schemas.openxmlformats.org/drawingml/2006/picture">
+                <pic:pic xmlns:pic="http://schemas.openxmlformats.org/drawingml/2006/picture">
+                  <pic:nvPicPr>
+                    <pic:cNvPr id="1703139129" name="Picture 1703139129"/>
+                    <pic:cNvPicPr/>
+                  </pic:nvPicPr>
+                  <pic:blipFill rotWithShape="1">
+                    <a:blip r:embed="rId9">
+                      <a:extLst>
+                        <a:ext uri="{28A0092B-C50C-407E-A947-70E740481C1C}">
+                          <a14:useLocalDpi xmlns:a14="http://schemas.microsoft.com/office/drawing/2010/main" val="0"/>
+                        </a:ext>
+                      </a:extLst>
+                    </a:blip>
+                    <a:srcRect t="3703" b="10339"/>
+                    <a:stretch>
+                      <a:fillRect/>
+                    </a:stretch>
+                  </pic:blipFill>
+                  <pic:spPr bwMode="auto">
+                    <a:xfrm>
+                      <a:off x="0" y="0"/>
+                      <a:ext cx="6333180" cy="8234445"/>
+                    </a:xfrm>
+                    <a:prstGeom prst="rect">
+                      <a:avLst/>
+                    </a:prstGeom>
+                    <a:ln>
+                      <a:noFill/>
+                    </a:ln>
+                    <a:extLst>
+                      <a:ext uri="{53640926-AAD7-44D8-BBD7-CCE9431645EC}">
+                        <a14:shadowObscured xmlns:a14="http://schemas.microsoft.com/office/drawing/2010/main"/>
+                      </a:ext>
+                    </a:extLst>
+                  </pic:spPr>
+                </pic:pic>
+              </a:graphicData>
+            </a:graphic>
+          </wp:inline>
+        </w:drawing>
+      </w:r>
     </w:p>
     <w:p>
       <w:pPr>
@@ -7783,7 +6579,7 @@
                     </pic:cNvPicPr>
                   </pic:nvPicPr>
                   <pic:blipFill rotWithShape="1">
-                    <a:blip r:embed="rId9" cstate="print">
+                    <a:blip r:embed="rId10" cstate="print">
                       <a:extLst>
                         <a:ext uri="{28A0092B-C50C-407E-A947-70E740481C1C}">
                           <a14:useLocalDpi xmlns:a14="http://schemas.microsoft.com/office/drawing/2010/main" val="0"/>
@@ -10720,7 +9516,7 @@
                     </pic:cNvPicPr>
                   </pic:nvPicPr>
                   <pic:blipFill rotWithShape="1">
-                    <a:blip r:embed="rId10" cstate="print">
+                    <a:blip r:embed="rId11" cstate="print">
                       <a:extLst>
                         <a:ext uri="{28A0092B-C50C-407E-A947-70E740481C1C}">
                           <a14:useLocalDpi xmlns:a14="http://schemas.microsoft.com/office/drawing/2010/main" val="0"/>
@@ -10817,7 +9613,7 @@
           <w:noProof/>
         </w:rPr>
         <w:drawing>
-          <wp:inline distT="0" distB="0" distL="0" distR="0" wp14:anchorId="707CAC5C" wp14:editId="28DDA460">
+          <wp:inline distT="0" distB="0" distL="0" distR="0" wp14:anchorId="707CAC5C" wp14:editId="166810EC">
             <wp:extent cx="4581843" cy="2971800"/>
             <wp:effectExtent l="0" t="0" r="9525" b="0"/>
             <wp:docPr id="1699036548" name="Picture 18"/>
@@ -10834,7 +9630,7 @@
                     </pic:cNvPicPr>
                   </pic:nvPicPr>
                   <pic:blipFill rotWithShape="1">
-                    <a:blip r:embed="rId11" cstate="print">
+                    <a:blip r:embed="rId12" cstate="print">
                       <a:extLst>
                         <a:ext uri="{28A0092B-C50C-407E-A947-70E740481C1C}">
                           <a14:useLocalDpi xmlns:a14="http://schemas.microsoft.com/office/drawing/2010/main" val="0"/>
@@ -13238,7 +12034,7 @@
                     </pic:cNvPicPr>
                   </pic:nvPicPr>
                   <pic:blipFill>
-                    <a:blip r:embed="rId12">
+                    <a:blip r:embed="rId13">
                       <a:extLst>
                         <a:ext uri="{28A0092B-C50C-407E-A947-70E740481C1C}">
                           <a14:useLocalDpi xmlns:a14="http://schemas.microsoft.com/office/drawing/2010/main" val="0"/>
@@ -13352,7 +12148,7 @@
                     </pic:cNvPicPr>
                   </pic:nvPicPr>
                   <pic:blipFill rotWithShape="1">
-                    <a:blip r:embed="rId13" cstate="print">
+                    <a:blip r:embed="rId14" cstate="print">
                       <a:extLst>
                         <a:ext uri="{28A0092B-C50C-407E-A947-70E740481C1C}">
                           <a14:useLocalDpi xmlns:a14="http://schemas.microsoft.com/office/drawing/2010/main" val="0"/>
@@ -13905,7 +12701,7 @@
                     <pic:cNvPicPr/>
                   </pic:nvPicPr>
                   <pic:blipFill>
-                    <a:blip r:embed="rId14"/>
+                    <a:blip r:embed="rId15"/>
                     <a:stretch>
                       <a:fillRect/>
                     </a:stretch>
@@ -14013,7 +12809,7 @@
                     <pic:cNvPicPr/>
                   </pic:nvPicPr>
                   <pic:blipFill>
-                    <a:blip r:embed="rId15"/>
+                    <a:blip r:embed="rId16"/>
                     <a:stretch>
                       <a:fillRect/>
                     </a:stretch>
@@ -14111,7 +12907,7 @@
                     <pic:cNvPicPr/>
                   </pic:nvPicPr>
                   <pic:blipFill>
-                    <a:blip r:embed="rId16"/>
+                    <a:blip r:embed="rId17"/>
                     <a:stretch>
                       <a:fillRect/>
                     </a:stretch>
@@ -15101,7 +13897,7 @@
         </w:rPr>
         <w:t xml:space="preserve">. Available at: </w:t>
       </w:r>
-      <w:hyperlink r:id="rId17" w:tgtFrame="_blank" w:history="1">
+      <w:hyperlink r:id="rId18" w:tgtFrame="_blank" w:history="1">
         <w:r>
           <w:rPr>
             <w:rStyle w:val="Hyperlink"/>
@@ -15473,7 +14269,7 @@
                     <pic:cNvPicPr/>
                   </pic:nvPicPr>
                   <pic:blipFill>
-                    <a:blip r:embed="rId18"/>
+                    <a:blip r:embed="rId19"/>
                     <a:stretch>
                       <a:fillRect/>
                     </a:stretch>
@@ -15597,7 +14393,7 @@
                     <pic:cNvPicPr/>
                   </pic:nvPicPr>
                   <pic:blipFill>
-                    <a:blip r:embed="rId19"/>
+                    <a:blip r:embed="rId20"/>
                     <a:stretch>
                       <a:fillRect/>
                     </a:stretch>
@@ -15741,7 +14537,7 @@
                     <pic:cNvPicPr/>
                   </pic:nvPicPr>
                   <pic:blipFill rotWithShape="1">
-                    <a:blip r:embed="rId20"/>
+                    <a:blip r:embed="rId21"/>
                     <a:srcRect r="23931"/>
                     <a:stretch>
                       <a:fillRect/>
@@ -15818,7 +14614,7 @@
                     </pic:cNvPicPr>
                   </pic:nvPicPr>
                   <pic:blipFill>
-                    <a:blip r:embed="rId21">
+                    <a:blip r:embed="rId22">
                       <a:extLst>
                         <a:ext uri="{28A0092B-C50C-407E-A947-70E740481C1C}">
                           <a14:useLocalDpi xmlns:a14="http://schemas.microsoft.com/office/drawing/2010/main" val="0"/>
@@ -15864,7 +14660,7 @@
       </w:pPr>
     </w:p>
     <w:sectPr>
-      <w:footerReference w:type="default" r:id="rId22"/>
+      <w:footerReference w:type="default" r:id="rId23"/>
       <w:pgSz w:w="12240" w:h="15840"/>
       <w:pgMar w:top="1440" w:right="1440" w:bottom="1440" w:left="1440" w:header="720" w:footer="720" w:gutter="0"/>
       <w:pgBorders w:offsetFrom="page">

</xml_diff>